<commit_message>
Add last page of Erdmann contract; mark signatures/stamp as /подпись/, /печать/
Co-Authored-By: Claude Opus 5.5 <noreply@anthropic.com>
Claude-Session: https://claude.ai/code/session_012MWwQEorHNY2L7P1JQTQXM
</commit_message>
<xml_diff>
--- a/Договор_аренды_перевод_RU.docx
+++ b/Договор_аренды_перевод_RU.docx
@@ -1980,7 +1980,7 @@
               <w:pBdr>
                 <w:bottom w:val="single" w:color="000000" w:sz="6" w:space="1"/>
               </w:pBdr>
-              <w:spacing w:after="0" w:before="360"/>
+              <w:spacing w:after="0" w:before="280"/>
             </w:pPr>
             <w:r>
               <w:rPr>
@@ -2009,7 +2009,7 @@
           </w:p>
           <w:p>
             <w:pPr>
-              <w:spacing w:before="400"/>
+              <w:spacing w:before="160"/>
             </w:pPr>
           </w:p>
           <w:p>
@@ -2017,7 +2017,7 @@
               <w:pBdr>
                 <w:bottom w:val="single" w:color="000000" w:sz="6" w:space="1"/>
               </w:pBdr>
-              <w:spacing w:after="0" w:before="360"/>
+              <w:spacing w:after="0" w:before="280"/>
             </w:pPr>
             <w:r>
               <w:rPr>
@@ -2028,7 +2028,7 @@
                 <w:sz w:val="18"/>
                 <w:szCs w:val="18"/>
               </w:rPr>
-              <w:t xml:space="preserve">[подпись]</w:t>
+              <w:t xml:space="preserve">/подпись/</w:t>
             </w:r>
           </w:p>
           <w:p>
@@ -2086,7 +2086,7 @@
               <w:pBdr>
                 <w:bottom w:val="single" w:color="000000" w:sz="6" w:space="1"/>
               </w:pBdr>
-              <w:spacing w:after="0" w:before="360"/>
+              <w:spacing w:after="0" w:before="280"/>
             </w:pPr>
             <w:r>
               <w:rPr>
@@ -2115,7 +2115,7 @@
           </w:p>
           <w:p>
             <w:pPr>
-              <w:spacing w:before="400"/>
+              <w:spacing w:before="160"/>
             </w:pPr>
           </w:p>
           <w:p>
@@ -2123,7 +2123,7 @@
               <w:pBdr>
                 <w:bottom w:val="single" w:color="000000" w:sz="6" w:space="1"/>
               </w:pBdr>
-              <w:spacing w:after="0" w:before="360"/>
+              <w:spacing w:after="0" w:before="280"/>
             </w:pPr>
             <w:r>
               <w:rPr>
@@ -2134,7 +2134,7 @@
                 <w:sz w:val="18"/>
                 <w:szCs w:val="18"/>
               </w:rPr>
-              <w:t xml:space="preserve">[подпись]</w:t>
+              <w:t xml:space="preserve">/подпись/</w:t>
             </w:r>
           </w:p>
           <w:p>
@@ -2196,7 +2196,7 @@
           <w:sz w:val="18"/>
           <w:szCs w:val="18"/>
         </w:rPr>
-        <w:t xml:space="preserve">[рукописная пометка]</w:t>
+        <w:t xml:space="preserve">/рукописная пометка/</w:t>
       </w:r>
     </w:p>
     <w:p>
@@ -2689,7 +2689,7 @@
           <w:sz w:val="18"/>
           <w:szCs w:val="18"/>
         </w:rPr>
-        <w:t xml:space="preserve">[рукописная пометка]</w:t>
+        <w:t xml:space="preserve">/рукописная пометка/</w:t>
       </w:r>
     </w:p>
     <w:p>
@@ -4419,8 +4419,682 @@
         <w:t xml:space="preserve">В период действия индексируемой арендной платы допускается только корректировка платежей по эксплуатационным расходам, а повышение арендной платы в связи с модернизацией может перекладываться на Арендатора только в отношении мероприятий, обусловленных обстоятельствами, за которые Арендодатель не отвечает.</w:t>
       </w:r>
     </w:p>
+    <w:p>
+      <w:pPr>
+        <w:sectPr>
+          <w:footerReference w:type="default" r:id="rId10"/>
+          <w:pgSz w:w="11906" w:h="16838" w:orient="portrait"/>
+          <w:pgMar w:top="700" w:right="1020" w:bottom="750" w:left="1134" w:header="708" w:footer="500" w:gutter="0"/>
+          <w:pgNumType/>
+          <w:docGrid w:linePitch="360"/>
+        </w:sectPr>
+      </w:pPr>
+    </w:p>
+    <w:p>
+      <w:pPr>
+        <w:tabs>
+          <w:tab w:val="left" w:pos="700"/>
+        </w:tabs>
+        <w:spacing w:after="0" w:before="0" w:line="240"/>
+        <w:ind w:left="700" w:hanging="350"/>
+        <w:jc w:val="both"/>
+      </w:pPr>
+      <w:r>
+        <w:rPr>
+          <w:rFonts w:ascii="Arial" w:cs="Arial" w:eastAsia="Arial" w:hAnsi="Arial"/>
+          <w:sz w:val="17"/>
+          <w:szCs w:val="17"/>
+        </w:rPr>
+        <w:t xml:space="preserve">✓</w:t>
+      </w:r>
+      <w:r>
+        <w:rPr>
+          <w:rFonts w:ascii="Arial" w:cs="Arial" w:eastAsia="Arial" w:hAnsi="Arial"/>
+          <w:sz w:val="17"/>
+          <w:szCs w:val="17"/>
+        </w:rPr>
+        <w:t xml:space="preserve">	</w:t>
+      </w:r>
+      <w:r>
+        <w:rPr>
+          <w:rFonts w:ascii="Arial" w:cs="Arial" w:eastAsia="Arial" w:hAnsi="Arial"/>
+          <w:sz w:val="17"/>
+          <w:szCs w:val="17"/>
+          <w:u w:val="single"/>
+        </w:rPr>
+        <w:t xml:space="preserve">Кухня</w:t>
+      </w:r>
+      <w:r>
+        <w:rPr>
+          <w:rFonts w:ascii="Arial" w:cs="Arial" w:eastAsia="Arial" w:hAnsi="Arial"/>
+          <w:sz w:val="17"/>
+          <w:szCs w:val="17"/>
+        </w:rPr>
+        <w:t xml:space="preserve">: пол, рабочие поверхности, духовой шкаф, плита и мойка подлежат очистке; следы от рук на кухонных шкафах подлежат удалению;</w:t>
+      </w:r>
+    </w:p>
+    <w:p>
+      <w:pPr>
+        <w:tabs>
+          <w:tab w:val="left" w:pos="700"/>
+        </w:tabs>
+        <w:spacing w:after="0" w:before="0" w:line="240"/>
+        <w:ind w:left="700" w:hanging="350"/>
+        <w:jc w:val="both"/>
+      </w:pPr>
+      <w:r>
+        <w:rPr>
+          <w:rFonts w:ascii="Arial" w:cs="Arial" w:eastAsia="Arial" w:hAnsi="Arial"/>
+          <w:sz w:val="17"/>
+          <w:szCs w:val="17"/>
+        </w:rPr>
+        <w:t xml:space="preserve">✓</w:t>
+      </w:r>
+      <w:r>
+        <w:rPr>
+          <w:rFonts w:ascii="Arial" w:cs="Arial" w:eastAsia="Arial" w:hAnsi="Arial"/>
+          <w:sz w:val="17"/>
+          <w:szCs w:val="17"/>
+        </w:rPr>
+        <w:t xml:space="preserve">	</w:t>
+      </w:r>
+      <w:r>
+        <w:rPr>
+          <w:rFonts w:ascii="Arial" w:cs="Arial" w:eastAsia="Arial" w:hAnsi="Arial"/>
+          <w:sz w:val="17"/>
+          <w:szCs w:val="17"/>
+          <w:u w:val="single"/>
+        </w:rPr>
+        <w:t xml:space="preserve">Полы</w:t>
+      </w:r>
+      <w:r>
+        <w:rPr>
+          <w:rFonts w:ascii="Arial" w:cs="Arial" w:eastAsia="Arial" w:hAnsi="Arial"/>
+          <w:sz w:val="17"/>
+          <w:szCs w:val="17"/>
+        </w:rPr>
+        <w:t xml:space="preserve">: ковровые покрытия подлежат чистке пылесосом; твёрдые напольные покрытия подлежат подметанию/чистке пылесосом и влажной уборке; плинтусы подлежат очистке;</w:t>
+      </w:r>
+    </w:p>
+    <w:p>
+      <w:pPr>
+        <w:tabs>
+          <w:tab w:val="left" w:pos="700"/>
+        </w:tabs>
+        <w:spacing w:after="0" w:before="0" w:line="240"/>
+        <w:ind w:left="700" w:hanging="350"/>
+        <w:jc w:val="both"/>
+      </w:pPr>
+      <w:r>
+        <w:rPr>
+          <w:rFonts w:ascii="Arial" w:cs="Arial" w:eastAsia="Arial" w:hAnsi="Arial"/>
+          <w:sz w:val="17"/>
+          <w:szCs w:val="17"/>
+        </w:rPr>
+        <w:t xml:space="preserve">✓</w:t>
+      </w:r>
+      <w:r>
+        <w:rPr>
+          <w:rFonts w:ascii="Arial" w:cs="Arial" w:eastAsia="Arial" w:hAnsi="Arial"/>
+          <w:sz w:val="17"/>
+          <w:szCs w:val="17"/>
+        </w:rPr>
+        <w:t xml:space="preserve">	</w:t>
+      </w:r>
+      <w:r>
+        <w:rPr>
+          <w:rFonts w:ascii="Arial" w:cs="Arial" w:eastAsia="Arial" w:hAnsi="Arial"/>
+          <w:sz w:val="17"/>
+          <w:szCs w:val="17"/>
+          <w:u w:val="single"/>
+        </w:rPr>
+        <w:t xml:space="preserve">Сантехническое оборудование/туалет/ванная</w:t>
+      </w:r>
+      <w:r>
+        <w:rPr>
+          <w:rFonts w:ascii="Arial" w:cs="Arial" w:eastAsia="Arial" w:hAnsi="Arial"/>
+          <w:sz w:val="17"/>
+          <w:szCs w:val="17"/>
+        </w:rPr>
+        <w:t xml:space="preserve">: пол, унитаз, сиденье унитаза, консоли (полки), облицованные плиткой стены туалета, ванна и/или душевые поддоны, перегородки, раковины с бортиками, зеркала, держатели ёршика для унитаза и зоны брызг подлежат очистке;</w:t>
+      </w:r>
+    </w:p>
+    <w:p>
+      <w:pPr>
+        <w:spacing w:after="20" w:before="60" w:line="240"/>
+        <w:jc w:val="center"/>
+      </w:pPr>
+      <w:r>
+        <w:rPr>
+          <w:rFonts w:ascii="Arial" w:cs="Arial" w:eastAsia="Arial" w:hAnsi="Arial"/>
+          <w:b/>
+          <w:bCs/>
+          <w:sz w:val="17"/>
+          <w:szCs w:val="17"/>
+        </w:rPr>
+        <w:t xml:space="preserve">§ 12 Несколько лиц на стороне Арендатора</w:t>
+      </w:r>
+    </w:p>
+    <w:p>
+      <w:pPr>
+        <w:spacing w:after="0" w:line="45" w:lineRule="exact"/>
+      </w:pPr>
+    </w:p>
+    <w:p>
+      <w:pPr>
+        <w:spacing w:after="0" w:before="0" w:line="240"/>
+        <w:jc w:val="both"/>
+      </w:pPr>
+      <w:r>
+        <w:rPr>
+          <w:rFonts w:ascii="Arial" w:cs="Arial" w:eastAsia="Arial" w:hAnsi="Arial"/>
+          <w:sz w:val="17"/>
+          <w:szCs w:val="17"/>
+        </w:rPr>
+        <w:t xml:space="preserve">(1) Заявления, действие которых затрагивает Арендаторов, должны делаться всеми Арендаторами или в адрес всех Арендаторов. Однако Арендаторы, с оговоркой о праве письменного отзыва, впредь до особого распоряжения взаимно уполномочивают друг друга на получение или подачу таких заявлений. Настоящая доверенность распространяется также на получение заявлений о расторжении договора, но не на подачу заявлений о расторжении договора и не на заключение соглашений о прекращении договора аренды. Отзыв доверенности вступает в силу только в отношении тех заявлений, которые сделаны после его получения.</w:t>
+      </w:r>
+    </w:p>
+    <w:p>
+      <w:pPr>
+        <w:spacing w:after="0" w:line="45" w:lineRule="exact"/>
+      </w:pPr>
+    </w:p>
+    <w:p>
+      <w:pPr>
+        <w:spacing w:after="0" w:before="0" w:line="240"/>
+        <w:jc w:val="both"/>
+      </w:pPr>
+      <w:r>
+        <w:rPr>
+          <w:rFonts w:ascii="Arial" w:cs="Arial" w:eastAsia="Arial" w:hAnsi="Arial"/>
+          <w:sz w:val="17"/>
+          <w:szCs w:val="17"/>
+        </w:rPr>
+        <w:t xml:space="preserve">(2) Каждый Арендатор обязан признавать в свою пользу и против себя обстоятельства, связанные с личностью или поведением члена семьи либо иного правомерного пользователя объекта аренды, которые затрагивают арендные отношения или служат основанием для требования о возмещении ущерба.</w:t>
+      </w:r>
+    </w:p>
+    <w:p>
+      <w:pPr>
+        <w:spacing w:after="0" w:line="45" w:lineRule="exact"/>
+      </w:pPr>
+    </w:p>
+    <w:p>
+      <w:pPr>
+        <w:spacing w:after="20" w:before="60" w:line="240"/>
+        <w:jc w:val="center"/>
+      </w:pPr>
+      <w:r>
+        <w:rPr>
+          <w:rFonts w:ascii="Arial" w:cs="Arial" w:eastAsia="Arial" w:hAnsi="Arial"/>
+          <w:b/>
+          <w:bCs/>
+          <w:sz w:val="17"/>
+          <w:szCs w:val="17"/>
+        </w:rPr>
+        <w:t xml:space="preserve">§ 13 Правила внутреннего распорядка дома</w:t>
+      </w:r>
+    </w:p>
+    <w:p>
+      <w:pPr>
+        <w:spacing w:after="0" w:line="45" w:lineRule="exact"/>
+      </w:pPr>
+    </w:p>
+    <w:p>
+      <w:pPr>
+        <w:spacing w:after="0" w:before="0" w:line="240"/>
+        <w:jc w:val="both"/>
+      </w:pPr>
+      <w:r>
+        <w:rPr>
+          <w:rFonts w:ascii="Arial" w:cs="Arial" w:eastAsia="Arial" w:hAnsi="Arial"/>
+          <w:sz w:val="17"/>
+          <w:szCs w:val="17"/>
+        </w:rPr>
+        <w:t xml:space="preserve">(1) Арендодатель и Арендатор обязуются соблюдать спокойствие в доме и проявлять взаимное уважение.</w:t>
+      </w:r>
+    </w:p>
+    <w:p>
+      <w:pPr>
+        <w:spacing w:after="0" w:line="45" w:lineRule="exact"/>
+      </w:pPr>
+    </w:p>
+    <w:p>
+      <w:pPr>
+        <w:spacing w:after="0" w:before="0" w:line="240"/>
+        <w:jc w:val="both"/>
+      </w:pPr>
+      <w:r>
+        <w:rPr>
+          <w:rFonts w:ascii="Arial" w:cs="Arial" w:eastAsia="Arial" w:hAnsi="Arial"/>
+          <w:sz w:val="17"/>
+          <w:szCs w:val="17"/>
+        </w:rPr>
+        <w:t xml:space="preserve">(2) Для поддержания порядка в доме и пользования объектами общего пользования действуют приложенные к настоящему договору правила внутреннего распорядка дома, если применимо. Они могут быть изменены Арендодателем, если этого требуют обоснованные интересы поддержания порядка или управления домом; об этих причинах Арендатору должно быть сообщено одновременно с новыми правилами внутреннего распорядка дома.</w:t>
+      </w:r>
+    </w:p>
+    <w:p>
+      <w:pPr>
+        <w:spacing w:after="20" w:before="60" w:line="240"/>
+        <w:jc w:val="center"/>
+      </w:pPr>
+      <w:r>
+        <w:rPr>
+          <w:rFonts w:ascii="Arial" w:cs="Arial" w:eastAsia="Arial" w:hAnsi="Arial"/>
+          <w:b/>
+          <w:bCs/>
+          <w:sz w:val="17"/>
+          <w:szCs w:val="17"/>
+        </w:rPr>
+        <w:t xml:space="preserve">§ 14 Защита персональных данных</w:t>
+      </w:r>
+    </w:p>
+    <w:p>
+      <w:pPr>
+        <w:spacing w:after="0" w:line="45" w:lineRule="exact"/>
+      </w:pPr>
+    </w:p>
+    <w:p>
+      <w:pPr>
+        <w:spacing w:after="0" w:before="0" w:line="240"/>
+        <w:jc w:val="both"/>
+      </w:pPr>
+      <w:r>
+        <w:rPr>
+          <w:rFonts w:ascii="Arial" w:cs="Arial" w:eastAsia="Arial" w:hAnsi="Arial"/>
+          <w:sz w:val="17"/>
+          <w:szCs w:val="17"/>
+        </w:rPr>
+        <w:t xml:space="preserve">Арендаторы соглашаются с тем, что их контактные данные, включая номера телефонов и/или адреса электронной почты, могут передаваться мастерам и сервисным компаниям, если это связано с арендуемой квартирой (службе снятия показаний — для согласования сроков, мастерам — для устранения аварий, страховой компании — для урегулирования ущерба…). Арендатор также соглашается с тем, что его данные обрабатываются и хранятся в системе управляющей компании.</w:t>
+      </w:r>
+    </w:p>
+    <w:p>
+      <w:pPr>
+        <w:spacing w:after="20" w:before="60" w:line="240"/>
+        <w:jc w:val="center"/>
+      </w:pPr>
+      <w:r>
+        <w:rPr>
+          <w:rFonts w:ascii="Arial" w:cs="Arial" w:eastAsia="Arial" w:hAnsi="Arial"/>
+          <w:b/>
+          <w:bCs/>
+          <w:sz w:val="17"/>
+          <w:szCs w:val="17"/>
+        </w:rPr>
+        <w:t xml:space="preserve">§ 15 Дополнительные услуги</w:t>
+      </w:r>
+    </w:p>
+    <w:p>
+      <w:pPr>
+        <w:spacing w:after="0" w:line="45" w:lineRule="exact"/>
+      </w:pPr>
+    </w:p>
+    <w:p>
+      <w:pPr>
+        <w:spacing w:after="0" w:before="0" w:line="240"/>
+        <w:jc w:val="both"/>
+      </w:pPr>
+      <w:r>
+        <w:rPr>
+          <w:rFonts w:ascii="Arial" w:cs="Arial" w:eastAsia="Arial" w:hAnsi="Arial"/>
+          <w:sz w:val="17"/>
+          <w:szCs w:val="17"/>
+        </w:rPr>
+        <w:t xml:space="preserve">Если Арендатор желает, чтобы в отношении арендуемой квартиры были заполнены формуляры для государственных органов или третьих лиц либо составлены письма в государственные органы или третьим лицам, он обязан уплатить за это плату в размере 23,50 € за каждое обращение. Эта сумма не выставляется Арендатору отдельным счётом, а включается в расчёт по эксплуатационным расходам за год, в котором возникли расходы.</w:t>
+      </w:r>
+    </w:p>
+    <w:p>
+      <w:pPr>
+        <w:spacing w:after="0" w:line="45" w:lineRule="exact"/>
+      </w:pPr>
+    </w:p>
+    <w:p>
+      <w:pPr>
+        <w:spacing w:after="20" w:before="60" w:line="240"/>
+        <w:jc w:val="center"/>
+      </w:pPr>
+      <w:r>
+        <w:rPr>
+          <w:rFonts w:ascii="Arial" w:cs="Arial" w:eastAsia="Arial" w:hAnsi="Arial"/>
+          <w:b/>
+          <w:bCs/>
+          <w:sz w:val="17"/>
+          <w:szCs w:val="17"/>
+        </w:rPr>
+        <w:t xml:space="preserve">§ 16 Прочие положения</w:t>
+      </w:r>
+    </w:p>
+    <w:p>
+      <w:pPr>
+        <w:spacing w:after="0" w:line="45" w:lineRule="exact"/>
+      </w:pPr>
+    </w:p>
+    <w:p>
+      <w:pPr>
+        <w:spacing w:after="0" w:before="0" w:line="240"/>
+        <w:jc w:val="both"/>
+      </w:pPr>
+      <w:r>
+        <w:rPr>
+          <w:rFonts w:ascii="Arial" w:cs="Arial" w:eastAsia="Arial" w:hAnsi="Arial"/>
+          <w:sz w:val="17"/>
+          <w:szCs w:val="17"/>
+        </w:rPr>
+        <w:t xml:space="preserve">(1) Арендаторы вправе совместно пользоваться садом, расположенным у гаража. Им разрешается установить там зонтичную сушилку для белья. Кроме того, разрешается разбить овощную грядку. При прекращении арендных отношений первоначальное состояние подлежит восстановлению.</w:t>
+      </w:r>
+    </w:p>
+    <w:p>
+      <w:pPr>
+        <w:spacing w:after="0" w:before="0" w:line="240"/>
+        <w:jc w:val="both"/>
+      </w:pPr>
+      <w:r>
+        <w:rPr>
+          <w:rFonts w:ascii="Arial" w:cs="Arial" w:eastAsia="Arial" w:hAnsi="Arial"/>
+          <w:sz w:val="17"/>
+          <w:szCs w:val="17"/>
+        </w:rPr>
+        <w:t xml:space="preserve">(2) Настоящим собственник обязуется обеспечить обновление душа до конца 2022 года. Поскольку сроки выполнения работ зависят от сантехнических фирм, точную дату в настоящее время назвать невозможно.</w:t>
+      </w:r>
+    </w:p>
+    <w:p>
+      <w:pPr>
+        <w:spacing w:after="20" w:before="60" w:line="240"/>
+        <w:jc w:val="center"/>
+      </w:pPr>
+      <w:r>
+        <w:rPr>
+          <w:rFonts w:ascii="Arial" w:cs="Arial" w:eastAsia="Arial" w:hAnsi="Arial"/>
+          <w:b/>
+          <w:bCs/>
+          <w:sz w:val="17"/>
+          <w:szCs w:val="17"/>
+        </w:rPr>
+        <w:t xml:space="preserve">§ 17 Оговорка о делимости</w:t>
+      </w:r>
+    </w:p>
+    <w:p>
+      <w:pPr>
+        <w:spacing w:after="0" w:line="45" w:lineRule="exact"/>
+      </w:pPr>
+    </w:p>
+    <w:p>
+      <w:pPr>
+        <w:spacing w:after="0" w:before="0" w:line="240"/>
+        <w:jc w:val="both"/>
+      </w:pPr>
+      <w:r>
+        <w:rPr>
+          <w:rFonts w:ascii="Arial" w:cs="Arial" w:eastAsia="Arial" w:hAnsi="Arial"/>
+          <w:sz w:val="17"/>
+          <w:szCs w:val="17"/>
+        </w:rPr>
+        <w:t xml:space="preserve">Если какое-либо из положений настоящего договора аренды, независимо от причины, окажется недействительным, остальные положения сохраняют силу без изменений. Однако стороны договора уже сейчас договариваются заменить недействительное положение действительным, которое в допустимой законом форме наиболее близко соответствует преследуемой цели.</w:t>
+      </w:r>
+    </w:p>
+    <w:tbl>
+      <w:tblPr>
+        <w:tblW w:type="dxa" w:w="9752"/>
+        <w:tblBorders>
+          <w:top w:val="none" w:color="FFFFFF" w:sz="0"/>
+          <w:left w:val="none" w:color="FFFFFF" w:sz="0"/>
+          <w:bottom w:val="none" w:color="FFFFFF" w:sz="0"/>
+          <w:right w:val="none" w:color="FFFFFF" w:sz="0"/>
+          <w:insideH w:val="none" w:color="FFFFFF" w:sz="0"/>
+          <w:insideV w:val="none" w:color="FFFFFF" w:sz="0"/>
+        </w:tblBorders>
+      </w:tblPr>
+      <w:tblGrid>
+        <w:gridCol w:w="4000"/>
+        <w:gridCol w:w="1752"/>
+        <w:gridCol w:w="4000"/>
+      </w:tblGrid>
+      <w:tr>
+        <w:tc>
+          <w:tcPr>
+            <w:tcW w:type="dxa" w:w="4000"/>
+            <w:tcBorders>
+              <w:top w:val="none" w:color="FFFFFF" w:sz="0"/>
+              <w:left w:val="none" w:color="FFFFFF" w:sz="0"/>
+              <w:bottom w:val="none" w:color="FFFFFF" w:sz="0"/>
+              <w:right w:val="none" w:color="FFFFFF" w:sz="0"/>
+            </w:tcBorders>
+          </w:tcPr>
+          <w:p>
+            <w:pPr>
+              <w:pBdr>
+                <w:bottom w:val="single" w:color="000000" w:sz="6" w:space="1"/>
+              </w:pBdr>
+              <w:spacing w:after="0" w:before="280"/>
+            </w:pPr>
+            <w:r>
+              <w:rPr>
+                <w:rFonts w:ascii="Arial" w:cs="Arial" w:eastAsia="Arial" w:hAnsi="Arial"/>
+                <w:i/>
+                <w:iCs/>
+                <w:sz w:val="17"/>
+                <w:szCs w:val="17"/>
+              </w:rPr>
+              <w:t xml:space="preserve">11.04.2022, Плауэн</w:t>
+            </w:r>
+          </w:p>
+          <w:p>
+            <w:pPr>
+              <w:spacing w:after="0" w:before="0" w:line="240"/>
+              <w:jc w:val="left"/>
+            </w:pPr>
+            <w:r>
+              <w:rPr>
+                <w:rFonts w:ascii="Arial" w:cs="Arial" w:eastAsia="Arial" w:hAnsi="Arial"/>
+                <w:sz w:val="17"/>
+                <w:szCs w:val="17"/>
+              </w:rPr>
+              <w:t xml:space="preserve">Место, дата</w:t>
+            </w:r>
+          </w:p>
+          <w:p>
+            <w:pPr>
+              <w:spacing w:before="60"/>
+            </w:pPr>
+          </w:p>
+          <w:p>
+            <w:pPr>
+              <w:spacing w:after="0" w:before="0" w:line="240"/>
+              <w:jc w:val="left"/>
+            </w:pPr>
+            <w:r>
+              <w:rPr>
+                <w:rFonts w:ascii="Arial" w:cs="Arial" w:eastAsia="Arial" w:hAnsi="Arial"/>
+                <w:i/>
+                <w:iCs/>
+                <w:color w:val="555555"/>
+                <w:sz w:val="17"/>
+                <w:szCs w:val="17"/>
+              </w:rPr>
+              <w:t xml:space="preserve">/печать: BHI BAUMANN Hausverwaltung &amp; Immobilien, Weststraße 57a, 08523 Plauen, Tel.: 03741-525311/</w:t>
+            </w:r>
+          </w:p>
+          <w:p>
+            <w:pPr>
+              <w:pBdr>
+                <w:bottom w:val="single" w:color="000000" w:sz="6" w:space="1"/>
+              </w:pBdr>
+              <w:spacing w:after="0" w:before="280"/>
+            </w:pPr>
+            <w:r>
+              <w:rPr>
+                <w:rFonts w:ascii="Arial" w:cs="Arial" w:eastAsia="Arial" w:hAnsi="Arial"/>
+                <w:i/>
+                <w:iCs/>
+                <w:color w:val="555555"/>
+                <w:sz w:val="17"/>
+                <w:szCs w:val="17"/>
+              </w:rPr>
+              <w:t xml:space="preserve">/подпись/</w:t>
+            </w:r>
+          </w:p>
+          <w:p>
+            <w:pPr>
+              <w:spacing w:after="0" w:before="0" w:line="240"/>
+              <w:jc w:val="left"/>
+            </w:pPr>
+            <w:r>
+              <w:rPr>
+                <w:rFonts w:ascii="Arial" w:cs="Arial" w:eastAsia="Arial" w:hAnsi="Arial"/>
+                <w:sz w:val="17"/>
+                <w:szCs w:val="17"/>
+              </w:rPr>
+              <w:t xml:space="preserve">(Арендодатель)</w:t>
+            </w:r>
+          </w:p>
+        </w:tc>
+        <w:tc>
+          <w:tcPr>
+            <w:tcW w:type="dxa" w:w="1752"/>
+            <w:tcBorders>
+              <w:top w:val="none" w:color="FFFFFF" w:sz="0"/>
+              <w:left w:val="none" w:color="FFFFFF" w:sz="0"/>
+              <w:bottom w:val="none" w:color="FFFFFF" w:sz="0"/>
+              <w:right w:val="none" w:color="FFFFFF" w:sz="0"/>
+            </w:tcBorders>
+          </w:tcPr>
+          <w:p>
+            <w:pPr>
+              <w:spacing w:after="0" w:before="0" w:line="240"/>
+              <w:jc w:val="left"/>
+            </w:pPr>
+            <w:r>
+              <w:rPr>
+                <w:rFonts w:ascii="Arial" w:cs="Arial" w:eastAsia="Arial" w:hAnsi="Arial"/>
+                <w:sz w:val="17"/>
+                <w:szCs w:val="17"/>
+              </w:rPr>
+              <w:t xml:space="preserve"/>
+            </w:r>
+          </w:p>
+        </w:tc>
+        <w:tc>
+          <w:tcPr>
+            <w:tcW w:type="dxa" w:w="4000"/>
+            <w:tcBorders>
+              <w:top w:val="none" w:color="FFFFFF" w:sz="0"/>
+              <w:left w:val="none" w:color="FFFFFF" w:sz="0"/>
+              <w:bottom w:val="none" w:color="FFFFFF" w:sz="0"/>
+              <w:right w:val="none" w:color="FFFFFF" w:sz="0"/>
+            </w:tcBorders>
+          </w:tcPr>
+          <w:p>
+            <w:pPr>
+              <w:pBdr>
+                <w:bottom w:val="single" w:color="000000" w:sz="6" w:space="1"/>
+              </w:pBdr>
+              <w:spacing w:after="0" w:before="280"/>
+            </w:pPr>
+            <w:r>
+              <w:rPr>
+                <w:rFonts w:ascii="Arial" w:cs="Arial" w:eastAsia="Arial" w:hAnsi="Arial"/>
+                <w:i/>
+                <w:iCs/>
+                <w:sz w:val="17"/>
+                <w:szCs w:val="17"/>
+              </w:rPr>
+              <w:t xml:space="preserve">08.04.22, Бад-Лобенштайн</w:t>
+            </w:r>
+          </w:p>
+          <w:p>
+            <w:pPr>
+              <w:spacing w:after="0" w:before="0" w:line="240"/>
+              <w:jc w:val="left"/>
+            </w:pPr>
+            <w:r>
+              <w:rPr>
+                <w:rFonts w:ascii="Arial" w:cs="Arial" w:eastAsia="Arial" w:hAnsi="Arial"/>
+                <w:sz w:val="17"/>
+                <w:szCs w:val="17"/>
+              </w:rPr>
+              <w:t xml:space="preserve">Место, дата</w:t>
+            </w:r>
+          </w:p>
+          <w:p>
+            <w:pPr>
+              <w:spacing w:before="160"/>
+            </w:pPr>
+          </w:p>
+          <w:p>
+            <w:pPr>
+              <w:pBdr>
+                <w:bottom w:val="single" w:color="000000" w:sz="6" w:space="1"/>
+              </w:pBdr>
+              <w:spacing w:after="0" w:before="280"/>
+            </w:pPr>
+            <w:r>
+              <w:rPr>
+                <w:rFonts w:ascii="Arial" w:cs="Arial" w:eastAsia="Arial" w:hAnsi="Arial"/>
+                <w:i/>
+                <w:iCs/>
+                <w:color w:val="555555"/>
+                <w:sz w:val="17"/>
+                <w:szCs w:val="17"/>
+              </w:rPr>
+              <w:t xml:space="preserve">/подпись/</w:t>
+            </w:r>
+          </w:p>
+          <w:p>
+            <w:pPr>
+              <w:spacing w:after="0" w:before="0" w:line="240"/>
+              <w:jc w:val="left"/>
+            </w:pPr>
+            <w:r>
+              <w:rPr>
+                <w:rFonts w:ascii="Arial" w:cs="Arial" w:eastAsia="Arial" w:hAnsi="Arial"/>
+                <w:sz w:val="17"/>
+                <w:szCs w:val="17"/>
+              </w:rPr>
+              <w:t xml:space="preserve">(Арендатор)</w:t>
+            </w:r>
+          </w:p>
+          <w:p>
+            <w:pPr>
+              <w:spacing w:before="160"/>
+            </w:pPr>
+          </w:p>
+          <w:p>
+            <w:pPr>
+              <w:pBdr>
+                <w:bottom w:val="single" w:color="000000" w:sz="6" w:space="1"/>
+              </w:pBdr>
+              <w:spacing w:after="0" w:before="280"/>
+            </w:pPr>
+            <w:r>
+              <w:rPr>
+                <w:rFonts w:ascii="Arial" w:cs="Arial" w:eastAsia="Arial" w:hAnsi="Arial"/>
+                <w:i/>
+                <w:iCs/>
+                <w:color w:val="555555"/>
+                <w:sz w:val="17"/>
+                <w:szCs w:val="17"/>
+              </w:rPr>
+              <w:t xml:space="preserve">/подпись/</w:t>
+            </w:r>
+          </w:p>
+          <w:p>
+            <w:pPr>
+              <w:spacing w:after="0" w:before="0" w:line="240"/>
+              <w:jc w:val="left"/>
+            </w:pPr>
+            <w:r>
+              <w:rPr>
+                <w:rFonts w:ascii="Arial" w:cs="Arial" w:eastAsia="Arial" w:hAnsi="Arial"/>
+                <w:sz w:val="17"/>
+                <w:szCs w:val="17"/>
+              </w:rPr>
+              <w:t xml:space="preserve">(Арендатор)</w:t>
+            </w:r>
+          </w:p>
+        </w:tc>
+      </w:tr>
+    </w:tbl>
     <w:sectPr>
-      <w:footerReference w:type="default" r:id="rId10"/>
+      <w:footerReference w:type="default" r:id="rId11"/>
       <w:pgSz w:w="11906" w:h="16838" w:orient="portrait"/>
       <w:pgMar w:top="700" w:right="1020" w:bottom="750" w:left="1134" w:header="708" w:footer="500" w:gutter="0"/>
       <w:pgNumType/>
@@ -4562,6 +5236,25 @@
 </w:ftr>
 </file>
 
+<file path=word/footer6.xml><?xml version="1.0" encoding="utf-8"?>
+<w:ftr xmlns:wpc="http://schemas.microsoft.com/office/word/2010/wordprocessingCanvas" xmlns:mc="http://schemas.openxmlformats.org/markup-compatibility/2006" xmlns:o="urn:schemas-microsoft-com:office:office" xmlns:r="http://schemas.openxmlformats.org/officeDocument/2006/relationships" xmlns:m="http://schemas.openxmlformats.org/officeDocument/2006/math" xmlns:v="urn:schemas-microsoft-com:vml" xmlns:wp14="http://schemas.microsoft.com/office/word/2010/wordprocessingDrawing" xmlns:wp="http://schemas.openxmlformats.org/drawingml/2006/wordprocessingDrawing" xmlns:w10="urn:schemas-microsoft-com:office:word" xmlns:w="http://schemas.openxmlformats.org/wordprocessingml/2006/main" xmlns:w14="http://schemas.microsoft.com/office/word/2010/wordml" xmlns:w15="http://schemas.microsoft.com/office/word/2012/wordml" xmlns:wpg="http://schemas.microsoft.com/office/word/2010/wordprocessingGroup" xmlns:wpi="http://schemas.microsoft.com/office/word/2010/wordprocessingInk" xmlns:wne="http://schemas.microsoft.com/office/word/2006/wordml" xmlns:wps="http://schemas.microsoft.com/office/word/2010/wordprocessingShape">
+  <w:p>
+    <w:pPr>
+      <w:spacing w:after="0" w:before="0" w:line="240"/>
+      <w:jc w:val="center"/>
+    </w:pPr>
+    <w:r>
+      <w:rPr>
+        <w:rFonts w:ascii="Arial" w:cs="Arial" w:eastAsia="Arial" w:hAnsi="Arial"/>
+        <w:sz w:val="16"/>
+        <w:szCs w:val="16"/>
+      </w:rPr>
+      <w:t xml:space="preserve"/>
+    </w:r>
+  </w:p>
+</w:ftr>
+</file>
+
 <file path=word/footnotes.xml><?xml version="1.0" encoding="utf-8"?>
 <w:footnotes xmlns:wpc="http://schemas.microsoft.com/office/word/2010/wordprocessingCanvas" xmlns:mc="http://schemas.openxmlformats.org/markup-compatibility/2006" xmlns:o="urn:schemas-microsoft-com:office:office" xmlns:r="http://schemas.openxmlformats.org/officeDocument/2006/relationships" xmlns:m="http://schemas.openxmlformats.org/officeDocument/2006/math" xmlns:v="urn:schemas-microsoft-com:vml" xmlns:wp14="http://schemas.microsoft.com/office/word/2010/wordprocessingDrawing" xmlns:wp="http://schemas.openxmlformats.org/drawingml/2006/wordprocessingDrawing" xmlns:w10="urn:schemas-microsoft-com:office:word" xmlns:w="http://schemas.openxmlformats.org/wordprocessingml/2006/main" xmlns:w14="http://schemas.microsoft.com/office/word/2010/wordml" xmlns:w15="http://schemas.microsoft.com/office/word/2012/wordml" xmlns:wpg="http://schemas.microsoft.com/office/word/2010/wordprocessingGroup" xmlns:wpi="http://schemas.microsoft.com/office/word/2010/wordprocessingInk" xmlns:wne="http://schemas.microsoft.com/office/word/2006/wordml" xmlns:wps="http://schemas.microsoft.com/office/word/2010/wordprocessingShape" mc:Ignorable="w14 w15 wp14">
   <w:footnote w:type="separator" w:id="-1">
@@ -4700,8 +5393,8 @@
     <w:rPrDefault>
       <w:rPr>
         <w:rFonts w:ascii="Arial" w:cs="Arial" w:eastAsia="Arial" w:hAnsi="Arial"/>
-        <w:sz w:val="18"/>
-        <w:szCs w:val="18"/>
+        <w:sz w:val="17"/>
+        <w:szCs w:val="17"/>
       </w:rPr>
     </w:rPrDefault>
     <w:pPrDefault/>

</xml_diff>